<commit_message>
Add full Instagram Carousel slide prompts, overlays and captions to docx and markdown
</commit_message>
<xml_diff>
--- a/docs/Mew-Maple-Sosyal-Medya-Promptlar-Ve-Metinler.docx
+++ b/docs/Mew-Maple-Sosyal-Medya-Promptlar-Ve-Metinler.docx
@@ -4474,6 +4474,2496 @@
         <w:t>Aesthetic clipboard with printed pet care checklist resting on a linen couch, curious cat sitting right next to it, warm interior daylight, cozy apartment home vibes, clean editorial lifestyle photography --ar 4:5 --v 6.0</w:t>
       </w:r>
     </w:p>
+    <!-- CAROUSEL SECTION HEADER -->
+    <w:p>
+      <w:pPr>
+        <w:spacing w:before="600" w:after="200"/>
+        <w:pBdr>
+          <w:top w:val="single" w:sz="36" w:space="15" w:color="D97736"/>
+        </w:pBdr>
+      </w:pPr>
+      <w:r>
+        <w:rPr>
+          <w:rFonts w:ascii="Georgia" w:hAnsi="Georgia"/>
+          <w:b/>
+          <w:sz w:val="44"/>
+          <w:color w:val="D97736"/>
+        </w:rPr>
+        <w:t>BÖLÜM 2: INSTAGRAM CAROUSEL (KAYDIRMALI GÖNDERİ) PAKETLERİ</w:t>
+      </w:r>
+    </w:p>
+    <w:p>
+      <w:pPr>
+        <w:spacing w:before="0" w:after="400"/>
+      </w:pPr>
+      <w:r>
+        <w:rPr>
+          <w:i/>
+          <w:sz w:val="22"/>
+          <w:color w:val="5C6A64"/>
+        </w:rPr>
+        <w:t>Her biri 5'er slayttan oluşan 4 adet kaydırmalı gönderi. Tüm slaytlar 4:5 Dikey Portre (1080x1350) formatında Midjourney/Flux görsel promptları, Canva yazı katmanları ve gönderi metinleriyle hazırlanmıştır.</w:t>
+      </w:r>
+    </w:p>
+    <w:p>
+      <w:pPr>
+        <w:spacing w:before="400" w:after="100"/>
+        <w:pBdr>
+          <w:top w:val="single" w:sz="18" w:space="10" w:color="263C34"/>
+        </w:pBdr>
+      </w:pPr>
+      <w:r>
+        <w:rPr>
+          <w:rFonts w:ascii="Georgia" w:hAnsi="Georgia"/>
+          <w:b/>
+          <w:sz w:val="32"/>
+          <w:color w:val="263C34"/>
+        </w:rPr>
+        <w:t>Carousel 1: 5 Apartment Cat Rules We Swear By (Kiracı Dostu 5 Kedi Kuralı)</w:t>
+      </w:r>
+    </w:p>
+    <w:p>
+      <w:pPr>
+        <w:spacing w:before="40" w:after="140"/>
+      </w:pPr>
+      <w:r>
+        <w:rPr>
+          <w:b/>
+          <w:color w:val="263C34"/>
+        </w:rPr>
+        <w:t>Kanca / Hook: </w:t>
+      </w:r>
+      <w:r>
+        <w:rPr>
+          <w:b/>
+          <w:color w:val="D97736"/>
+        </w:rPr>
+        <w:t>5 Apartment Cat Rules We Swear By (That Landlords Won’t Complain About) 🛋️✨</w:t>
+      </w:r>
+    </w:p>
+    <w:p>
+      <w:pPr>
+        <w:spacing w:before="140" w:after="40"/>
+      </w:pPr>
+      <w:r>
+        <w:rPr>
+          <w:b/>
+          <w:sz w:val="22"/>
+          <w:color w:val="263C34"/>
+        </w:rPr>
+        <w:t>🖼️ Slayt 1: Cover / Hook</w:t>
+      </w:r>
+    </w:p>
+    <w:p>
+      <w:pPr>
+        <w:spacing w:before="20" w:after="20"/>
+      </w:pPr>
+      <w:r>
+        <w:rPr>
+          <w:b/>
+          <w:color w:val="5C6A64"/>
+        </w:rPr>
+        <w:t>Canva Başlığı: </w:t>
+      </w:r>
+      <w:r>
+        <w:rPr>
+          <w:b/>
+          <w:color w:val="D97736"/>
+        </w:rPr>
+        <w:t>"5 APARTMENT CAT RULES WE SWEAR BY (That Landlords Won't Complain About)"</w:t>
+      </w:r>
+    </w:p>
+    <w:p>
+      <w:pPr>
+        <w:spacing w:before="20" w:after="40"/>
+      </w:pPr>
+      <w:r>
+        <w:rPr>
+          <w:b/>
+          <w:color w:val="5C6A64"/>
+        </w:rPr>
+        <w:t>Canva Alt Açıklama: </w:t>
+      </w:r>
+      <w:r>
+        <w:rPr>
+          <w:i/>
+        </w:rPr>
+        <w:t>Swipe to read →</w:t>
+      </w:r>
+    </w:p>
+    <w:p>
+      <w:pPr>
+        <w:spacing w:before="40" w:after="120"/>
+        <w:shd w:val="clear" w:color="auto" w:fill="FAF8F5"/>
+        <w:pBdr>
+          <w:left w:val="single" w:sz="18" w:space="10" w:color="D97736"/>
+        </w:pBdr>
+      </w:pPr>
+      <w:r>
+        <w:rPr>
+          <w:b/>
+          <w:sz w:val="16"/>
+          <w:color w:val="D97736"/>
+        </w:rPr>
+        <w:t>AI GÖRSEL PROMPTU (--ar 4:5):
+</w:t>
+      </w:r>
+      <w:r>
+        <w:rPr>
+          <w:rFonts w:ascii="Consolas" w:hAnsi="Consolas"/>
+          <w:sz w:val="18"/>
+          <w:color w:val="2C3531"/>
+        </w:rPr>
+        <w:t>Minimalist Scandinavian apartment living room, a content adult cat sitting gracefully on a cream linen rug looking directly at the camera, modern warm aesthetic, muted sage green wall, soft golden hour sunlight, architectural pet living photography, high-end interior editorial style, shot on 35mm f/2.0 --ar 4:5 --v 6.0</w:t>
+      </w:r>
+    </w:p>
+    <w:p>
+      <w:pPr>
+        <w:spacing w:before="140" w:after="40"/>
+      </w:pPr>
+      <w:r>
+        <w:rPr>
+          <w:b/>
+          <w:sz w:val="22"/>
+          <w:color w:val="263C34"/>
+        </w:rPr>
+        <w:t>🖼️ Slayt 2: Rule 1: Scratching Post Placement</w:t>
+      </w:r>
+    </w:p>
+    <w:p>
+      <w:pPr>
+        <w:spacing w:before="20" w:after="20"/>
+      </w:pPr>
+      <w:r>
+        <w:rPr>
+          <w:b/>
+          <w:color w:val="5C6A64"/>
+        </w:rPr>
+        <w:t>Canva Başlığı: </w:t>
+      </w:r>
+      <w:r>
+        <w:rPr>
+          <w:b/>
+          <w:color w:val="D97736"/>
+        </w:rPr>
+        <w:t>"RULE 1: DON'T HIDE THE SCRATCHER"</w:t>
+      </w:r>
+    </w:p>
+    <w:p>
+      <w:pPr>
+        <w:spacing w:before="20" w:after="40"/>
+      </w:pPr>
+      <w:r>
+        <w:rPr>
+          <w:b/>
+          <w:color w:val="5C6A64"/>
+        </w:rPr>
+        <w:t>Canva Alt Açıklama: </w:t>
+      </w:r>
+      <w:r>
+        <w:rPr>
+          <w:i/>
+        </w:rPr>
+        <w:t>Cats scratch sofa arms to mark prominent social boundaries. Place a sturdy post right where they already want to scratch.</w:t>
+      </w:r>
+    </w:p>
+    <w:p>
+      <w:pPr>
+        <w:spacing w:before="40" w:after="120"/>
+        <w:shd w:val="clear" w:color="auto" w:fill="FAF8F5"/>
+        <w:pBdr>
+          <w:left w:val="single" w:sz="18" w:space="10" w:color="D97736"/>
+        </w:pBdr>
+      </w:pPr>
+      <w:r>
+        <w:rPr>
+          <w:b/>
+          <w:sz w:val="16"/>
+          <w:color w:val="D97736"/>
+        </w:rPr>
+        <w:t>AI GÖRSEL PROMPTU (--ar 4:5):
+</w:t>
+      </w:r>
+      <w:r>
+        <w:rPr>
+          <w:rFonts w:ascii="Consolas" w:hAnsi="Consolas"/>
+          <w:sz w:val="18"/>
+          <w:color w:val="2C3531"/>
+        </w:rPr>
+        <w:t>Aesthetic living room corner shot showing a sleek, modern tall sisal scratching post placed directly flush against the corner of a contemporary beige sofa, cat paw stretched scratching the sisal, natural morning light, clean tidy floor, interior design photography --ar 4:5 --v 6.0</w:t>
+      </w:r>
+    </w:p>
+    <w:p>
+      <w:pPr>
+        <w:spacing w:before="140" w:after="40"/>
+      </w:pPr>
+      <w:r>
+        <w:rPr>
+          <w:b/>
+          <w:sz w:val="22"/>
+          <w:color w:val="263C34"/>
+        </w:rPr>
+        <w:t>🖼️ Slayt 3: Rule 2: Drill-Free Vertical Space</w:t>
+      </w:r>
+    </w:p>
+    <w:p>
+      <w:pPr>
+        <w:spacing w:before="20" w:after="20"/>
+      </w:pPr>
+      <w:r>
+        <w:rPr>
+          <w:b/>
+          <w:color w:val="5C6A64"/>
+        </w:rPr>
+        <w:t>Canva Başlığı: </w:t>
+      </w:r>
+      <w:r>
+        <w:rPr>
+          <w:b/>
+          <w:color w:val="D97736"/>
+        </w:rPr>
+        <w:t>"RULE 2: VERTICAL SPACE WITHOUT DRILLS"</w:t>
+      </w:r>
+    </w:p>
+    <w:p>
+      <w:pPr>
+        <w:spacing w:before="20" w:after="40"/>
+      </w:pPr>
+      <w:r>
+        <w:rPr>
+          <w:b/>
+          <w:color w:val="5C6A64"/>
+        </w:rPr>
+        <w:t>Canva Alt Açıklama: </w:t>
+      </w:r>
+      <w:r>
+        <w:rPr>
+          <w:i/>
+        </w:rPr>
+        <w:t>Clear existing furniture tops (bookshelves, credenzas) with non-slip washable mats. Instant high perches with zero drywall damage.</w:t>
+      </w:r>
+    </w:p>
+    <w:p>
+      <w:pPr>
+        <w:spacing w:before="40" w:after="120"/>
+        <w:shd w:val="clear" w:color="auto" w:fill="FAF8F5"/>
+        <w:pBdr>
+          <w:left w:val="single" w:sz="18" w:space="10" w:color="D97736"/>
+        </w:pBdr>
+      </w:pPr>
+      <w:r>
+        <w:rPr>
+          <w:b/>
+          <w:sz w:val="16"/>
+          <w:color w:val="D97736"/>
+        </w:rPr>
+        <w:t>AI GÖRSEL PROMPTU (--ar 4:5):
+</w:t>
+      </w:r>
+      <w:r>
+        <w:rPr>
+          <w:rFonts w:ascii="Consolas" w:hAnsi="Consolas"/>
+          <w:sz w:val="18"/>
+          <w:color w:val="2C3531"/>
+        </w:rPr>
+        <w:t>Low modern wood bookshelf in a small apartment, the top surface cleared and styled with a cozy felt mat where a fluffy cat rests looking down happily, zero wall anchors or screws, soft warm ambient lighting, peaceful home vibe --ar 4:5 --v 6.0</w:t>
+      </w:r>
+    </w:p>
+    <w:p>
+      <w:pPr>
+        <w:spacing w:before="140" w:after="40"/>
+      </w:pPr>
+      <w:r>
+        <w:rPr>
+          <w:b/>
+          <w:sz w:val="22"/>
+          <w:color w:val="263C34"/>
+        </w:rPr>
+        <w:t>🖼️ Slayt 4: Rule 3: High-Sided Open Litter Boxes</w:t>
+      </w:r>
+    </w:p>
+    <w:p>
+      <w:pPr>
+        <w:spacing w:before="20" w:after="20"/>
+      </w:pPr>
+      <w:r>
+        <w:rPr>
+          <w:b/>
+          <w:color w:val="5C6A64"/>
+        </w:rPr>
+        <w:t>Canva Başlığı: </w:t>
+      </w:r>
+      <w:r>
+        <w:rPr>
+          <w:b/>
+          <w:color w:val="D97736"/>
+        </w:rPr>
+        <w:t>"RULE 3: HIGH-SIDED OPEN BOXES BEAT HOODS"</w:t>
+      </w:r>
+    </w:p>
+    <w:p>
+      <w:pPr>
+        <w:spacing w:before="20" w:after="40"/>
+      </w:pPr>
+      <w:r>
+        <w:rPr>
+          <w:b/>
+          <w:color w:val="5C6A64"/>
+        </w:rPr>
+        <w:t>Canva Alt Açıklama: </w:t>
+      </w:r>
+      <w:r>
+        <w:rPr>
+          <w:i/>
+        </w:rPr>
+        <w:t>Closed lids trap ammonia fumes and drive cats away. High-sided open boxes stop floor scatter while maintaining healthy airflow.</w:t>
+      </w:r>
+    </w:p>
+    <w:p>
+      <w:pPr>
+        <w:spacing w:before="40" w:after="120"/>
+        <w:shd w:val="clear" w:color="auto" w:fill="FAF8F5"/>
+        <w:pBdr>
+          <w:left w:val="single" w:sz="18" w:space="10" w:color="D97736"/>
+        </w:pBdr>
+      </w:pPr>
+      <w:r>
+        <w:rPr>
+          <w:b/>
+          <w:sz w:val="16"/>
+          <w:color w:val="D97736"/>
+        </w:rPr>
+        <w:t>AI GÖRSEL PROMPTU (--ar 4:5):
+</w:t>
+      </w:r>
+      <w:r>
+        <w:rPr>
+          <w:rFonts w:ascii="Consolas" w:hAnsi="Consolas"/>
+          <w:sz w:val="18"/>
+          <w:color w:val="2C3531"/>
+        </w:rPr>
+        <w:t>Tidy modern apartment bathroom corner, featuring a sleek high-sided open litter box on clean tile floor with a textured rubber catching mat, minimalist aesthetic, bright clean daylight, fresh airy feeling --ar 4:5 --v 6.0</w:t>
+      </w:r>
+    </w:p>
+    <w:p>
+      <w:pPr>
+        <w:spacing w:before="140" w:after="40"/>
+      </w:pPr>
+      <w:r>
+        <w:rPr>
+          <w:b/>
+          <w:sz w:val="22"/>
+          <w:color w:val="263C34"/>
+        </w:rPr>
+        <w:t>🖼️ Slayt 5: Outro &amp; Call To Action</w:t>
+      </w:r>
+    </w:p>
+    <w:p>
+      <w:pPr>
+        <w:spacing w:before="20" w:after="20"/>
+      </w:pPr>
+      <w:r>
+        <w:rPr>
+          <w:b/>
+          <w:color w:val="5C6A64"/>
+        </w:rPr>
+        <w:t>Canva Başlığı: </w:t>
+      </w:r>
+      <w:r>
+        <w:rPr>
+          <w:b/>
+          <w:color w:val="D97736"/>
+        </w:rPr>
+        <w:t>"READY TO AUDIT YOUR SPACE?"</w:t>
+      </w:r>
+    </w:p>
+    <w:p>
+      <w:pPr>
+        <w:spacing w:before="20" w:after="40"/>
+      </w:pPr>
+      <w:r>
+        <w:rPr>
+          <w:b/>
+          <w:color w:val="5C6A64"/>
+        </w:rPr>
+        <w:t>Canva Alt Açıklama: </w:t>
+      </w:r>
+      <w:r>
+        <w:rPr>
+          <w:i/>
+        </w:rPr>
+        <w:t>Download our free printable Small-Home Cat Setup Checklist! Tap the link in bio (@mewandmaple) or visit mewandmaple.com.</w:t>
+      </w:r>
+    </w:p>
+    <w:p>
+      <w:pPr>
+        <w:spacing w:before="40" w:after="120"/>
+        <w:shd w:val="clear" w:color="auto" w:fill="FAF8F5"/>
+        <w:pBdr>
+          <w:left w:val="single" w:sz="18" w:space="10" w:color="D97736"/>
+        </w:pBdr>
+      </w:pPr>
+      <w:r>
+        <w:rPr>
+          <w:b/>
+          <w:sz w:val="16"/>
+          <w:color w:val="D97736"/>
+        </w:rPr>
+        <w:t>AI GÖRSEL PROMPTU (--ar 4:5):
+</w:t>
+      </w:r>
+      <w:r>
+        <w:rPr>
+          <w:rFonts w:ascii="Consolas" w:hAnsi="Consolas"/>
+          <w:sz w:val="18"/>
+          <w:color w:val="2C3531"/>
+        </w:rPr>
+        <w:t>Aesthetic flatlay mockup on a natural wooden table: a printed checklist titled 'Small-Home Cat Setup Checklist', a warm cup of coffee, a peaceful tabby cat resting its chin on paws in the corner of frame, warm cozy morning light, organized pet life --ar 4:5 --v 6.0</w:t>
+      </w:r>
+    </w:p>
+    <w:p>
+      <w:pPr>
+        <w:spacing w:before="120" w:after="40"/>
+      </w:pPr>
+      <w:r>
+        <w:rPr>
+          <w:b/>
+          <w:color w:val="263C34"/>
+        </w:rPr>
+        <w:t>Gönderi Metni (Caption):</w:t>
+      </w:r>
+    </w:p>
+    <w:p>
+      <w:pPr>
+        <w:spacing w:before="20" w:after="20"/>
+      </w:pPr>
+      <w:r>
+        <w:rPr>
+          <w:sz w:val="20"/>
+        </w:rPr>
+        <w:t>5 Apartment Cat Rules We Swear By (That Landlords Won’t Complain About) 🛋️✨</w:t>
+      </w:r>
+    </w:p>
+    <w:p>
+      <w:pPr>
+        <w:spacing w:before="20" w:after="20"/>
+      </w:pPr>
+      <w:r>
+        <w:rPr>
+          <w:sz w:val="20"/>
+        </w:rPr>
+        <w:t/>
+      </w:r>
+    </w:p>
+    <w:p>
+      <w:pPr>
+        <w:spacing w:before="20" w:after="20"/>
+      </w:pPr>
+      <w:r>
+        <w:rPr>
+          <w:sz w:val="20"/>
+        </w:rPr>
+        <w:t>Living in a rental apartment with a cat doesn't mean sacrificing your security deposit or your interior decor. </w:t>
+      </w:r>
+    </w:p>
+    <w:p>
+      <w:pPr>
+        <w:spacing w:before="20" w:after="20"/>
+      </w:pPr>
+      <w:r>
+        <w:rPr>
+          <w:sz w:val="20"/>
+        </w:rPr>
+        <w:t/>
+      </w:r>
+    </w:p>
+    <w:p>
+      <w:pPr>
+        <w:spacing w:before="20" w:after="20"/>
+      </w:pPr>
+      <w:r>
+        <w:rPr>
+          <w:sz w:val="20"/>
+        </w:rPr>
+        <w:t>Swipe through for 5 practical rules we swear by:</w:t>
+      </w:r>
+    </w:p>
+    <w:p>
+      <w:pPr>
+        <w:spacing w:before="20" w:after="20"/>
+      </w:pPr>
+      <w:r>
+        <w:rPr>
+          <w:sz w:val="20"/>
+        </w:rPr>
+        <w:t>👉 Rule 1: Place sturdy scratchers directly against sofa corners where cats mark territory.</w:t>
+      </w:r>
+    </w:p>
+    <w:p>
+      <w:pPr>
+        <w:spacing w:before="20" w:after="20"/>
+      </w:pPr>
+      <w:r>
+        <w:rPr>
+          <w:sz w:val="20"/>
+        </w:rPr>
+        <w:t>👉 Rule 2: Create vertical paths using existing low furniture with non-slip felt mats.</w:t>
+      </w:r>
+    </w:p>
+    <w:p>
+      <w:pPr>
+        <w:spacing w:before="20" w:after="20"/>
+      </w:pPr>
+      <w:r>
+        <w:rPr>
+          <w:sz w:val="20"/>
+        </w:rPr>
+        <w:t>👉 Rule 3: Use high-sided open litter boxes to contain scatter without trapping odors.</w:t>
+      </w:r>
+    </w:p>
+    <w:p>
+      <w:pPr>
+        <w:spacing w:before="20" w:after="20"/>
+      </w:pPr>
+      <w:r>
+        <w:rPr>
+          <w:sz w:val="20"/>
+        </w:rPr>
+        <w:t>👉 Rule 4: Swap flimsy plastic blinds for cordless Roman shades or tension rod curtains.</w:t>
+      </w:r>
+    </w:p>
+    <w:p>
+      <w:pPr>
+        <w:spacing w:before="20" w:after="20"/>
+      </w:pPr>
+      <w:r>
+        <w:rPr>
+          <w:sz w:val="20"/>
+        </w:rPr>
+        <w:t>👉 Rule 5: Install floor-to-ceiling tension climbing poles with zero drywall holes.</w:t>
+      </w:r>
+    </w:p>
+    <w:p>
+      <w:pPr>
+        <w:spacing w:before="20" w:after="20"/>
+      </w:pPr>
+      <w:r>
+        <w:rPr>
+          <w:sz w:val="20"/>
+        </w:rPr>
+        <w:t/>
+      </w:r>
+    </w:p>
+    <w:p>
+      <w:pPr>
+        <w:spacing w:before="20" w:after="20"/>
+      </w:pPr>
+      <w:r>
+        <w:rPr>
+          <w:sz w:val="20"/>
+        </w:rPr>
+        <w:t>Which of these rules do you use in your apartment? Tell us below! 👇</w:t>
+      </w:r>
+    </w:p>
+    <w:p>
+      <w:pPr>
+        <w:spacing w:before="20" w:after="20"/>
+      </w:pPr>
+      <w:r>
+        <w:rPr>
+          <w:sz w:val="20"/>
+        </w:rPr>
+        <w:t>📥 Grab our free Small-Home Cat Setup Checklist via the link in our bio (@mewandmaple)!</w:t>
+      </w:r>
+    </w:p>
+    <w:p>
+      <w:pPr>
+        <w:spacing w:before="40" w:after="200"/>
+      </w:pPr>
+      <w:r>
+        <w:rPr>
+          <w:b/>
+          <w:color w:val="263C34"/>
+        </w:rPr>
+        <w:t>Hashtag Seti: </w:t>
+      </w:r>
+      <w:r>
+        <w:rPr>
+          <w:color w:val="5C6A64"/>
+          <w:sz w:val="18"/>
+        </w:rPr>
+        <w:t>#apartmentcat #renterfriendly #catfriendlyhome #catmomlife #indoorcats #smallspaceliving #cattips #catdecor #catcare #petfriendlyapartment #interiorstylingwithcats</w:t>
+      </w:r>
+    </w:p>
+    <w:p>
+      <w:pPr>
+        <w:spacing w:before="400" w:after="100"/>
+        <w:pBdr>
+          <w:top w:val="single" w:sz="18" w:space="10" w:color="263C34"/>
+        </w:pBdr>
+      </w:pPr>
+      <w:r>
+        <w:rPr>
+          <w:rFonts w:ascii="Georgia" w:hAnsi="Georgia"/>
+          <w:b/>
+          <w:sz w:val="32"/>
+          <w:color w:val="263C34"/>
+        </w:rPr>
+        <w:t>Carousel 2: How to Tire Out an Indoor Cat in 15 Minutes (15 Dakikada Kediyi Yorma Rutini)</w:t>
+      </w:r>
+    </w:p>
+    <w:p>
+      <w:pPr>
+        <w:spacing w:before="40" w:after="140"/>
+      </w:pPr>
+      <w:r>
+        <w:rPr>
+          <w:b/>
+          <w:color w:val="263C34"/>
+        </w:rPr>
+        <w:t>Kanca / Hook: </w:t>
+      </w:r>
+      <w:r>
+        <w:rPr>
+          <w:b/>
+          <w:color w:val="D97736"/>
+        </w:rPr>
+        <w:t>Does your cat turn into a midnight racer at 2 A.M.? Here is how to tire them out in 15 minutes. 🏎️💨</w:t>
+      </w:r>
+    </w:p>
+    <w:p>
+      <w:pPr>
+        <w:spacing w:before="140" w:after="40"/>
+      </w:pPr>
+      <w:r>
+        <w:rPr>
+          <w:b/>
+          <w:sz w:val="22"/>
+          <w:color w:val="263C34"/>
+        </w:rPr>
+        <w:t>🖼️ Slayt 1: Cover / Hook</w:t>
+      </w:r>
+    </w:p>
+    <w:p>
+      <w:pPr>
+        <w:spacing w:before="20" w:after="20"/>
+      </w:pPr>
+      <w:r>
+        <w:rPr>
+          <w:b/>
+          <w:color w:val="5C6A64"/>
+        </w:rPr>
+        <w:t>Canva Başlığı: </w:t>
+      </w:r>
+      <w:r>
+        <w:rPr>
+          <w:b/>
+          <w:color w:val="D97736"/>
+        </w:rPr>
+        <w:t>"HOW TO TIRE OUT AN INDOOR CAT IN 15 MINUTES (Without Night Zoomies)"</w:t>
+      </w:r>
+    </w:p>
+    <w:p>
+      <w:pPr>
+        <w:spacing w:before="20" w:after="40"/>
+      </w:pPr>
+      <w:r>
+        <w:rPr>
+          <w:b/>
+          <w:color w:val="5C6A64"/>
+        </w:rPr>
+        <w:t>Canva Alt Açıklama: </w:t>
+      </w:r>
+      <w:r>
+        <w:rPr>
+          <w:i/>
+        </w:rPr>
+        <w:t>Swipe to see the bedtime routine →</w:t>
+      </w:r>
+    </w:p>
+    <w:p>
+      <w:pPr>
+        <w:spacing w:before="40" w:after="120"/>
+        <w:shd w:val="clear" w:color="auto" w:fill="FAF8F5"/>
+        <w:pBdr>
+          <w:left w:val="single" w:sz="18" w:space="10" w:color="D97736"/>
+        </w:pBdr>
+      </w:pPr>
+      <w:r>
+        <w:rPr>
+          <w:b/>
+          <w:sz w:val="16"/>
+          <w:color w:val="D97736"/>
+        </w:rPr>
+        <w:t>AI GÖRSEL PROMPTU (--ar 4:5):
+</w:t>
+      </w:r>
+      <w:r>
+        <w:rPr>
+          <w:rFonts w:ascii="Consolas" w:hAnsi="Consolas"/>
+          <w:sz w:val="18"/>
+          <w:color w:val="2C3531"/>
+        </w:rPr>
+        <w:t>Intense cinematic close-up of a domestic cat's focused dilated pupils tracking a moving toy, dramatic warm side lighting, soft cozy living room background, predatory feline focus, crisp fur texture, 85mm macro lens pet photography --ar 4:5 --v 6.0</w:t>
+      </w:r>
+    </w:p>
+    <w:p>
+      <w:pPr>
+        <w:spacing w:before="140" w:after="40"/>
+      </w:pPr>
+      <w:r>
+        <w:rPr>
+          <w:b/>
+          <w:sz w:val="22"/>
+          <w:color w:val="263C34"/>
+        </w:rPr>
+        <w:t>🖼️ Slayt 2: Step 1: Stalk &amp; Chase</w:t>
+      </w:r>
+    </w:p>
+    <w:p>
+      <w:pPr>
+        <w:spacing w:before="20" w:after="20"/>
+      </w:pPr>
+      <w:r>
+        <w:rPr>
+          <w:b/>
+          <w:color w:val="5C6A64"/>
+        </w:rPr>
+        <w:t>Canva Başlığı: </w:t>
+      </w:r>
+      <w:r>
+        <w:rPr>
+          <w:b/>
+          <w:color w:val="D97736"/>
+        </w:rPr>
+        <w:t>"STEP 1: STALK &amp; CHASE (MINUTES 0–10)"</w:t>
+      </w:r>
+    </w:p>
+    <w:p>
+      <w:pPr>
+        <w:spacing w:before="20" w:after="40"/>
+      </w:pPr>
+      <w:r>
+        <w:rPr>
+          <w:b/>
+          <w:color w:val="5C6A64"/>
+        </w:rPr>
+        <w:t>Canva Alt Açıklama: </w:t>
+      </w:r>
+      <w:r>
+        <w:rPr>
+          <w:i/>
+        </w:rPr>
+        <w:t>Never wave toys in your cat's face. Prey naturally runs away! Move the wand along floorboards, around corners, and under chairs.</w:t>
+      </w:r>
+    </w:p>
+    <w:p>
+      <w:pPr>
+        <w:spacing w:before="40" w:after="120"/>
+        <w:shd w:val="clear" w:color="auto" w:fill="FAF8F5"/>
+        <w:pBdr>
+          <w:left w:val="single" w:sz="18" w:space="10" w:color="D97736"/>
+        </w:pBdr>
+      </w:pPr>
+      <w:r>
+        <w:rPr>
+          <w:b/>
+          <w:sz w:val="16"/>
+          <w:color w:val="D97736"/>
+        </w:rPr>
+        <w:t>AI GÖRSEL PROMPTU (--ar 4:5):
+</w:t>
+      </w:r>
+      <w:r>
+        <w:rPr>
+          <w:rFonts w:ascii="Consolas" w:hAnsi="Consolas"/>
+          <w:sz w:val="18"/>
+          <w:color w:val="2C3531"/>
+        </w:rPr>
+        <w:t>Dynamic shot of a cat crouching in playful stalking posture on a textured living room rug, a feather wand lure gliding along the floor away from the cat, warm evening lamplight, authentic interactive play --ar 4:5 --v 6.0</w:t>
+      </w:r>
+    </w:p>
+    <w:p>
+      <w:pPr>
+        <w:spacing w:before="140" w:after="40"/>
+      </w:pPr>
+      <w:r>
+        <w:rPr>
+          <w:b/>
+          <w:sz w:val="22"/>
+          <w:color w:val="263C34"/>
+        </w:rPr>
+        <w:t>🖼️ Slayt 3: Step 2: The Crucial Catch</w:t>
+      </w:r>
+    </w:p>
+    <w:p>
+      <w:pPr>
+        <w:spacing w:before="20" w:after="20"/>
+      </w:pPr>
+      <w:r>
+        <w:rPr>
+          <w:b/>
+          <w:color w:val="5C6A64"/>
+        </w:rPr>
+        <w:t>Canva Başlığı: </w:t>
+      </w:r>
+      <w:r>
+        <w:rPr>
+          <w:b/>
+          <w:color w:val="D97736"/>
+        </w:rPr>
+        <w:t>"STEP 2: THE CRUCIAL CATCH (MINUTES 10–12)"</w:t>
+      </w:r>
+    </w:p>
+    <w:p>
+      <w:pPr>
+        <w:spacing w:before="20" w:after="40"/>
+      </w:pPr>
+      <w:r>
+        <w:rPr>
+          <w:b/>
+          <w:color w:val="5C6A64"/>
+        </w:rPr>
+        <w:t>Canva Alt Açıklama: </w:t>
+      </w:r>
+      <w:r>
+        <w:rPr>
+          <w:i/>
+        </w:rPr>
+        <w:t>Let them physically catch and 'kill' the lure multiple times. Frustration happens when cats chase without tactile completion.</w:t>
+      </w:r>
+    </w:p>
+    <w:p>
+      <w:pPr>
+        <w:spacing w:before="40" w:after="120"/>
+        <w:shd w:val="clear" w:color="auto" w:fill="FAF8F5"/>
+        <w:pBdr>
+          <w:left w:val="single" w:sz="18" w:space="10" w:color="D97736"/>
+        </w:pBdr>
+      </w:pPr>
+      <w:r>
+        <w:rPr>
+          <w:b/>
+          <w:sz w:val="16"/>
+          <w:color w:val="D97736"/>
+        </w:rPr>
+        <w:t>AI GÖRSEL PROMPTU (--ar 4:5):
+</w:t>
+      </w:r>
+      <w:r>
+        <w:rPr>
+          <w:rFonts w:ascii="Consolas" w:hAnsi="Consolas"/>
+          <w:sz w:val="18"/>
+          <w:color w:val="2C3531"/>
+        </w:rPr>
+        <w:t>A domestic cat victoriously clutching a feather toy between its front paws on a cozy rug, kicking with back legs playfully, proud and satisfied expression, warm indoor evening lighting --ar 4:5 --v 6.0</w:t>
+      </w:r>
+    </w:p>
+    <w:p>
+      <w:pPr>
+        <w:spacing w:before="140" w:after="40"/>
+      </w:pPr>
+      <w:r>
+        <w:rPr>
+          <w:b/>
+          <w:sz w:val="22"/>
+          <w:color w:val="263C34"/>
+        </w:rPr>
+        <w:t>🖼️ Slayt 4: Step 3: Cool Down &amp; Bedtime Snack</w:t>
+      </w:r>
+    </w:p>
+    <w:p>
+      <w:pPr>
+        <w:spacing w:before="20" w:after="20"/>
+      </w:pPr>
+      <w:r>
+        <w:rPr>
+          <w:b/>
+          <w:color w:val="5C6A64"/>
+        </w:rPr>
+        <w:t>Canva Başlığı: </w:t>
+      </w:r>
+      <w:r>
+        <w:rPr>
+          <w:b/>
+          <w:color w:val="D97736"/>
+        </w:rPr>
+        <w:t>"STEP 3: COOL DOWN &amp; FEED (MINUTES 12–15)"</w:t>
+      </w:r>
+    </w:p>
+    <w:p>
+      <w:pPr>
+        <w:spacing w:before="20" w:after="40"/>
+      </w:pPr>
+      <w:r>
+        <w:rPr>
+          <w:b/>
+          <w:color w:val="5C6A64"/>
+        </w:rPr>
+        <w:t>Canva Alt Açıklama: </w:t>
+      </w:r>
+      <w:r>
+        <w:rPr>
+          <w:i/>
+        </w:rPr>
+        <w:t>Slow the wand down to mimic tired prey, then immediately offer a small protein snack. 'Hunt -&gt; Catch -&gt; Eat -&gt; Sleep' is hardwired biology.</w:t>
+      </w:r>
+    </w:p>
+    <w:p>
+      <w:pPr>
+        <w:spacing w:before="40" w:after="120"/>
+        <w:shd w:val="clear" w:color="auto" w:fill="FAF8F5"/>
+        <w:pBdr>
+          <w:left w:val="single" w:sz="18" w:space="10" w:color="D97736"/>
+        </w:pBdr>
+      </w:pPr>
+      <w:r>
+        <w:rPr>
+          <w:b/>
+          <w:sz w:val="16"/>
+          <w:color w:val="D97736"/>
+        </w:rPr>
+        <w:t>AI GÖRSEL PROMPTU (--ar 4:5):
+</w:t>
+      </w:r>
+      <w:r>
+        <w:rPr>
+          <w:rFonts w:ascii="Consolas" w:hAnsi="Consolas"/>
+          <w:sz w:val="18"/>
+          <w:color w:val="2C3531"/>
+        </w:rPr>
+        <w:t>A cute cat eating a small savory meal from a shallow ceramic bowl on a clean wooden floor, warm evening lighting, relaxed calm body language, peaceful kitchen corner --ar 4:5 --v 6.0</w:t>
+      </w:r>
+    </w:p>
+    <w:p>
+      <w:pPr>
+        <w:spacing w:before="140" w:after="40"/>
+      </w:pPr>
+      <w:r>
+        <w:rPr>
+          <w:b/>
+          <w:sz w:val="22"/>
+          <w:color w:val="263C34"/>
+        </w:rPr>
+        <w:t>🖼️ Slayt 5: Outro &amp; Free Planner CTA</w:t>
+      </w:r>
+    </w:p>
+    <w:p>
+      <w:pPr>
+        <w:spacing w:before="20" w:after="20"/>
+      </w:pPr>
+      <w:r>
+        <w:rPr>
+          <w:b/>
+          <w:color w:val="5C6A64"/>
+        </w:rPr>
+        <w:t>Canva Başlığı: </w:t>
+      </w:r>
+      <w:r>
+        <w:rPr>
+          <w:b/>
+          <w:color w:val="D97736"/>
+        </w:rPr>
+        <w:t>"WANT A PEACEFUL NIGHT'S SLEEP?"</w:t>
+      </w:r>
+    </w:p>
+    <w:p>
+      <w:pPr>
+        <w:spacing w:before="20" w:after="40"/>
+      </w:pPr>
+      <w:r>
+        <w:rPr>
+          <w:b/>
+          <w:color w:val="5C6A64"/>
+        </w:rPr>
+        <w:t>Canva Alt Açıklama: </w:t>
+      </w:r>
+      <w:r>
+        <w:rPr>
+          <w:i/>
+        </w:rPr>
+        <w:t>Download our free printable 7-Day Indoor Cat Activity Planner to schedule your daily play sessions. Link in bio (@mewandmaple)!</w:t>
+      </w:r>
+    </w:p>
+    <w:p>
+      <w:pPr>
+        <w:spacing w:before="40" w:after="120"/>
+        <w:shd w:val="clear" w:color="auto" w:fill="FAF8F5"/>
+        <w:pBdr>
+          <w:left w:val="single" w:sz="18" w:space="10" w:color="D97736"/>
+        </w:pBdr>
+      </w:pPr>
+      <w:r>
+        <w:rPr>
+          <w:b/>
+          <w:sz w:val="16"/>
+          <w:color w:val="D97736"/>
+        </w:rPr>
+        <w:t>AI GÖRSEL PROMPTU (--ar 4:5):
+</w:t>
+      </w:r>
+      <w:r>
+        <w:rPr>
+          <w:rFonts w:ascii="Consolas" w:hAnsi="Consolas"/>
+          <w:sz w:val="18"/>
+          <w:color w:val="2C3531"/>
+        </w:rPr>
+        <w:t>A deeply relaxed cat curled up in a fluffy round donut bed fast asleep, peaceful nighttime bedroom atmosphere, warm soft lamp glow, tranquil domestic scene --ar 4:5 --v 6.0</w:t>
+      </w:r>
+    </w:p>
+    <w:p>
+      <w:pPr>
+        <w:spacing w:before="120" w:after="40"/>
+      </w:pPr>
+      <w:r>
+        <w:rPr>
+          <w:b/>
+          <w:color w:val="263C34"/>
+        </w:rPr>
+        <w:t>Gönderi Metni (Caption):</w:t>
+      </w:r>
+    </w:p>
+    <w:p>
+      <w:pPr>
+        <w:spacing w:before="20" w:after="20"/>
+      </w:pPr>
+      <w:r>
+        <w:rPr>
+          <w:sz w:val="20"/>
+        </w:rPr>
+        <w:t>Does your cat turn into a midnight racer at 2 A.M.? Here is how to tire them out in 15 minutes. 🏎️💨</w:t>
+      </w:r>
+    </w:p>
+    <w:p>
+      <w:pPr>
+        <w:spacing w:before="20" w:after="20"/>
+      </w:pPr>
+      <w:r>
+        <w:rPr>
+          <w:sz w:val="20"/>
+        </w:rPr>
+        <w:t/>
+      </w:r>
+    </w:p>
+    <w:p>
+      <w:pPr>
+        <w:spacing w:before="20" w:after="20"/>
+      </w:pPr>
+      <w:r>
+        <w:rPr>
+          <w:sz w:val="20"/>
+        </w:rPr>
+        <w:t>Midnight zoomies happen when indoor cats have pent-up predatory energy with no outlet. Waving toys randomly doesn't work—you need to complete their biological sequence:</w:t>
+      </w:r>
+    </w:p>
+    <w:p>
+      <w:pPr>
+        <w:spacing w:before="20" w:after="20"/>
+      </w:pPr>
+      <w:r>
+        <w:rPr>
+          <w:sz w:val="20"/>
+        </w:rPr>
+        <w:t/>
+      </w:r>
+    </w:p>
+    <w:p>
+      <w:pPr>
+        <w:spacing w:before="20" w:after="20"/>
+      </w:pPr>
+      <w:r>
+        <w:rPr>
+          <w:sz w:val="20"/>
+        </w:rPr>
+        <w:t>🎯 Minutes 0–10: The Stalk &amp; Chase</w:t>
+      </w:r>
+    </w:p>
+    <w:p>
+      <w:pPr>
+        <w:spacing w:before="20" w:after="20"/>
+      </w:pPr>
+      <w:r>
+        <w:rPr>
+          <w:sz w:val="20"/>
+        </w:rPr>
+        <w:t>Mimic realistic prey moving away from your cat. Let them plan their pounce!</w:t>
+      </w:r>
+    </w:p>
+    <w:p>
+      <w:pPr>
+        <w:spacing w:before="20" w:after="20"/>
+      </w:pPr>
+      <w:r>
+        <w:rPr>
+          <w:sz w:val="20"/>
+        </w:rPr>
+        <w:t/>
+      </w:r>
+    </w:p>
+    <w:p>
+      <w:pPr>
+        <w:spacing w:before="20" w:after="20"/>
+      </w:pPr>
+      <w:r>
+        <w:rPr>
+          <w:sz w:val="20"/>
+        </w:rPr>
+        <w:t>🐾 Minutes 10–12: The Crucial Catch</w:t>
+      </w:r>
+    </w:p>
+    <w:p>
+      <w:pPr>
+        <w:spacing w:before="20" w:after="20"/>
+      </w:pPr>
+      <w:r>
+        <w:rPr>
+          <w:sz w:val="20"/>
+        </w:rPr>
+        <w:t>Allow them to physically catch and 'kill' the lure between their paws. Never skip the catch!</w:t>
+      </w:r>
+    </w:p>
+    <w:p>
+      <w:pPr>
+        <w:spacing w:before="20" w:after="20"/>
+      </w:pPr>
+      <w:r>
+        <w:rPr>
+          <w:sz w:val="20"/>
+        </w:rPr>
+        <w:t/>
+      </w:r>
+    </w:p>
+    <w:p>
+      <w:pPr>
+        <w:spacing w:before="20" w:after="20"/>
+      </w:pPr>
+      <w:r>
+        <w:rPr>
+          <w:sz w:val="20"/>
+        </w:rPr>
+        <w:t>🌾 Minutes 12–15: The Cool Down</w:t>
+      </w:r>
+    </w:p>
+    <w:p>
+      <w:pPr>
+        <w:spacing w:before="20" w:after="20"/>
+      </w:pPr>
+      <w:r>
+        <w:rPr>
+          <w:sz w:val="20"/>
+        </w:rPr>
+        <w:t>Slow down movements to let their heart rate normalize.</w:t>
+      </w:r>
+    </w:p>
+    <w:p>
+      <w:pPr>
+        <w:spacing w:before="20" w:after="20"/>
+      </w:pPr>
+      <w:r>
+        <w:rPr>
+          <w:sz w:val="20"/>
+        </w:rPr>
+        <w:t/>
+      </w:r>
+    </w:p>
+    <w:p>
+      <w:pPr>
+        <w:spacing w:before="20" w:after="20"/>
+      </w:pPr>
+      <w:r>
+        <w:rPr>
+          <w:sz w:val="20"/>
+        </w:rPr>
+        <w:t>🍗 Minute 15: The Bedtime Meal</w:t>
+      </w:r>
+    </w:p>
+    <w:p>
+      <w:pPr>
+        <w:spacing w:before="20" w:after="20"/>
+      </w:pPr>
+      <w:r>
+        <w:rPr>
+          <w:sz w:val="20"/>
+        </w:rPr>
+        <w:t>Feed a small protein snack or wet food. Biology takes over: Hunt ➡️ Catch ➡️ Eat ➡️ Groom ➡️ SLEEP.</w:t>
+      </w:r>
+    </w:p>
+    <w:p>
+      <w:pPr>
+        <w:spacing w:before="20" w:after="20"/>
+      </w:pPr>
+      <w:r>
+        <w:rPr>
+          <w:sz w:val="20"/>
+        </w:rPr>
+        <w:t/>
+      </w:r>
+    </w:p>
+    <w:p>
+      <w:pPr>
+        <w:spacing w:before="20" w:after="20"/>
+      </w:pPr>
+      <w:r>
+        <w:rPr>
+          <w:sz w:val="20"/>
+        </w:rPr>
+        <w:t>Swipe through for the breakdown! Save this for tonight's bedtime routine! 😴</w:t>
+      </w:r>
+    </w:p>
+    <w:p>
+      <w:pPr>
+        <w:spacing w:before="20" w:after="20"/>
+      </w:pPr>
+      <w:r>
+        <w:rPr>
+          <w:sz w:val="20"/>
+        </w:rPr>
+        <w:t>📥 Grab our free 7-Day Indoor Cat Activity Planner via the link in bio!</w:t>
+      </w:r>
+    </w:p>
+    <w:p>
+      <w:pPr>
+        <w:spacing w:before="40" w:after="200"/>
+      </w:pPr>
+      <w:r>
+        <w:rPr>
+          <w:b/>
+          <w:color w:val="263C34"/>
+        </w:rPr>
+        <w:t>Hashtag Seti: </w:t>
+      </w:r>
+      <w:r>
+        <w:rPr>
+          <w:color w:val="5C6A64"/>
+          <w:sz w:val="18"/>
+        </w:rPr>
+        <w:t>#catzoomies #catbehavior #catroutine #catplaytime #indoorcat #catenrichment #catmomtips #nighttimezoomies #happycats #catwellness #bedtimeroutine</w:t>
+      </w:r>
+    </w:p>
+    <w:p>
+      <w:pPr>
+        <w:spacing w:before="400" w:after="100"/>
+        <w:pBdr>
+          <w:top w:val="single" w:sz="18" w:space="10" w:color="263C34"/>
+        </w:pBdr>
+      </w:pPr>
+      <w:r>
+        <w:rPr>
+          <w:rFonts w:ascii="Georgia" w:hAnsi="Georgia"/>
+          <w:b/>
+          <w:sz w:val="32"/>
+          <w:color w:val="263C34"/>
+        </w:rPr>
+        <w:t>Carousel 3: Leaving Your Cat While at Work? The 4-Zone Rule (İşe Giderken 4 Bölge Kuralı)</w:t>
+      </w:r>
+    </w:p>
+    <w:p>
+      <w:pPr>
+        <w:spacing w:before="40" w:after="140"/>
+      </w:pPr>
+      <w:r>
+        <w:rPr>
+          <w:b/>
+          <w:color w:val="263C34"/>
+        </w:rPr>
+        <w:t>Kanca / Hook: </w:t>
+      </w:r>
+      <w:r>
+        <w:rPr>
+          <w:b/>
+          <w:color w:val="D97736"/>
+        </w:rPr>
+        <w:t>Leaving your indoor cat alone while you're at work? Set up these 4 zones first. 🏢🐈</w:t>
+      </w:r>
+    </w:p>
+    <w:p>
+      <w:pPr>
+        <w:spacing w:before="140" w:after="40"/>
+      </w:pPr>
+      <w:r>
+        <w:rPr>
+          <w:b/>
+          <w:sz w:val="22"/>
+          <w:color w:val="263C34"/>
+        </w:rPr>
+        <w:t>🖼️ Slayt 1: Cover / Hook</w:t>
+      </w:r>
+    </w:p>
+    <w:p>
+      <w:pPr>
+        <w:spacing w:before="20" w:after="20"/>
+      </w:pPr>
+      <w:r>
+        <w:rPr>
+          <w:b/>
+          <w:color w:val="5C6A64"/>
+        </w:rPr>
+        <w:t>Canva Başlığı: </w:t>
+      </w:r>
+      <w:r>
+        <w:rPr>
+          <w:b/>
+          <w:color w:val="D97736"/>
+        </w:rPr>
+        <w:t>"LEAVING YOUR CAT WHILE AT WORK? Set Up These 4 Zones First."</w:t>
+      </w:r>
+    </w:p>
+    <w:p>
+      <w:pPr>
+        <w:spacing w:before="20" w:after="40"/>
+      </w:pPr>
+      <w:r>
+        <w:rPr>
+          <w:b/>
+          <w:color w:val="5C6A64"/>
+        </w:rPr>
+        <w:t>Canva Alt Açıklama: </w:t>
+      </w:r>
+      <w:r>
+        <w:rPr>
+          <w:i/>
+        </w:rPr>
+        <w:t>Swipe to set up your home →</w:t>
+      </w:r>
+    </w:p>
+    <w:p>
+      <w:pPr>
+        <w:spacing w:before="40" w:after="120"/>
+        <w:shd w:val="clear" w:color="auto" w:fill="FAF8F5"/>
+        <w:pBdr>
+          <w:left w:val="single" w:sz="18" w:space="10" w:color="D97736"/>
+        </w:pBdr>
+      </w:pPr>
+      <w:r>
+        <w:rPr>
+          <w:b/>
+          <w:sz w:val="16"/>
+          <w:color w:val="D97736"/>
+        </w:rPr>
+        <w:t>AI GÖRSEL PROMPTU (--ar 4:5):
+</w:t>
+      </w:r>
+      <w:r>
+        <w:rPr>
+          <w:rFonts w:ascii="Consolas" w:hAnsi="Consolas"/>
+          <w:sz w:val="18"/>
+          <w:color w:val="2C3531"/>
+        </w:rPr>
+        <w:t>A curious cat sitting calmly on an entryway rug looking towards the doorway of an aesthetic warm apartment, soft morning light, cozy home atmosphere, thoughtful editorial pet photography --ar 4:5 --v 6.0</w:t>
+      </w:r>
+    </w:p>
+    <w:p>
+      <w:pPr>
+        <w:spacing w:before="140" w:after="40"/>
+      </w:pPr>
+      <w:r>
+        <w:rPr>
+          <w:b/>
+          <w:sz w:val="22"/>
+          <w:color w:val="263C34"/>
+        </w:rPr>
+        <w:t>🖼️ Slayt 2: Zone 1: Window Theatre</w:t>
+      </w:r>
+    </w:p>
+    <w:p>
+      <w:pPr>
+        <w:spacing w:before="20" w:after="20"/>
+      </w:pPr>
+      <w:r>
+        <w:rPr>
+          <w:b/>
+          <w:color w:val="5C6A64"/>
+        </w:rPr>
+        <w:t>Canva Başlığı: </w:t>
+      </w:r>
+      <w:r>
+        <w:rPr>
+          <w:b/>
+          <w:color w:val="D97736"/>
+        </w:rPr>
+        <w:t>"ZONE 1: SAFE WINDOW THEATRE"</w:t>
+      </w:r>
+    </w:p>
+    <w:p>
+      <w:pPr>
+        <w:spacing w:before="20" w:after="40"/>
+      </w:pPr>
+      <w:r>
+        <w:rPr>
+          <w:b/>
+          <w:color w:val="5C6A64"/>
+        </w:rPr>
+        <w:t>Canva Alt Açıklama: </w:t>
+      </w:r>
+      <w:r>
+        <w:rPr>
+          <w:i/>
+        </w:rPr>
+        <w:t>Visual enrichment prevents daytime boredom. Keep blind cords securely tied up and check window screen tightness.</w:t>
+      </w:r>
+    </w:p>
+    <w:p>
+      <w:pPr>
+        <w:spacing w:before="40" w:after="120"/>
+        <w:shd w:val="clear" w:color="auto" w:fill="FAF8F5"/>
+        <w:pBdr>
+          <w:left w:val="single" w:sz="18" w:space="10" w:color="D97736"/>
+        </w:pBdr>
+      </w:pPr>
+      <w:r>
+        <w:rPr>
+          <w:b/>
+          <w:sz w:val="16"/>
+          <w:color w:val="D97736"/>
+        </w:rPr>
+        <w:t>AI GÖRSEL PROMPTU (--ar 4:5):
+</w:t>
+      </w:r>
+      <w:r>
+        <w:rPr>
+          <w:rFonts w:ascii="Consolas" w:hAnsi="Consolas"/>
+          <w:sz w:val="18"/>
+          <w:color w:val="2C3531"/>
+        </w:rPr>
+        <w:t>Calm cat lounging on an upholstered window seat looking outside at autumn trees, blinds safely drawn up and cords tucked away, warm sunbeam across the room --ar 4:5 --v 6.0</w:t>
+      </w:r>
+    </w:p>
+    <w:p>
+      <w:pPr>
+        <w:spacing w:before="140" w:after="40"/>
+      </w:pPr>
+      <w:r>
+        <w:rPr>
+          <w:b/>
+          <w:sz w:val="22"/>
+          <w:color w:val="263C34"/>
+        </w:rPr>
+        <w:t>🖼️ Slayt 3: Zone 2: Independent Foraging</w:t>
+      </w:r>
+    </w:p>
+    <w:p>
+      <w:pPr>
+        <w:spacing w:before="20" w:after="20"/>
+      </w:pPr>
+      <w:r>
+        <w:rPr>
+          <w:b/>
+          <w:color w:val="5C6A64"/>
+        </w:rPr>
+        <w:t>Canva Başlığı: </w:t>
+      </w:r>
+      <w:r>
+        <w:rPr>
+          <w:b/>
+          <w:color w:val="D97736"/>
+        </w:rPr>
+        <w:t>"ZONE 2: INDEPENDENT FORAGING"</w:t>
+      </w:r>
+    </w:p>
+    <w:p>
+      <w:pPr>
+        <w:spacing w:before="20" w:after="40"/>
+      </w:pPr>
+      <w:r>
+        <w:rPr>
+          <w:b/>
+          <w:color w:val="5C6A64"/>
+        </w:rPr>
+        <w:t>Canva Alt Açıklama: </w:t>
+      </w:r>
+      <w:r>
+        <w:rPr>
+          <w:i/>
+        </w:rPr>
+        <w:t>Never leave string or wand toys unattended! Use safe cardboard puzzle feeders with dry treats hidden around the room.</w:t>
+      </w:r>
+    </w:p>
+    <w:p>
+      <w:pPr>
+        <w:spacing w:before="40" w:after="120"/>
+        <w:shd w:val="clear" w:color="auto" w:fill="FAF8F5"/>
+        <w:pBdr>
+          <w:left w:val="single" w:sz="18" w:space="10" w:color="D97736"/>
+        </w:pBdr>
+      </w:pPr>
+      <w:r>
+        <w:rPr>
+          <w:b/>
+          <w:sz w:val="16"/>
+          <w:color w:val="D97736"/>
+        </w:rPr>
+        <w:t>AI GÖRSEL PROMPTU (--ar 4:5):
+</w:t>
+      </w:r>
+      <w:r>
+        <w:rPr>
+          <w:rFonts w:ascii="Consolas" w:hAnsi="Consolas"/>
+          <w:sz w:val="18"/>
+          <w:color w:val="2C3531"/>
+        </w:rPr>
+        <w:t>A simple cardboard treat puzzle box hidden under a wooden coffee table, a cat sniffing and reaching in to extract a treat, cozy apartment morning light --ar 4:5 --v 6.0</w:t>
+      </w:r>
+    </w:p>
+    <w:p>
+      <w:pPr>
+        <w:spacing w:before="140" w:after="40"/>
+      </w:pPr>
+      <w:r>
+        <w:rPr>
+          <w:b/>
+          <w:sz w:val="22"/>
+          <w:color w:val="263C34"/>
+        </w:rPr>
+        <w:t>🖼️ Slayt 4: Zone 3 &amp; 4: Retreat &amp; Hydration</w:t>
+      </w:r>
+    </w:p>
+    <w:p>
+      <w:pPr>
+        <w:spacing w:before="20" w:after="20"/>
+      </w:pPr>
+      <w:r>
+        <w:rPr>
+          <w:b/>
+          <w:color w:val="5C6A64"/>
+        </w:rPr>
+        <w:t>Canva Başlığı: </w:t>
+      </w:r>
+      <w:r>
+        <w:rPr>
+          <w:b/>
+          <w:color w:val="D97736"/>
+        </w:rPr>
+        <w:t>"ZONE 3 &amp; 4: RETREAT &amp; HYDRATION"</w:t>
+      </w:r>
+    </w:p>
+    <w:p>
+      <w:pPr>
+        <w:spacing w:before="20" w:after="40"/>
+      </w:pPr>
+      <w:r>
+        <w:rPr>
+          <w:b/>
+          <w:color w:val="5C6A64"/>
+        </w:rPr>
+        <w:t>Canva Alt Açıklama: </w:t>
+      </w:r>
+      <w:r>
+        <w:rPr>
+          <w:i/>
+        </w:rPr>
+        <w:t>Provide high quiet sleeping caves away from noisy appliances, and place water bowls in a separate room from food.</w:t>
+      </w:r>
+    </w:p>
+    <w:p>
+      <w:pPr>
+        <w:spacing w:before="40" w:after="120"/>
+        <w:shd w:val="clear" w:color="auto" w:fill="FAF8F5"/>
+        <w:pBdr>
+          <w:left w:val="single" w:sz="18" w:space="10" w:color="D97736"/>
+        </w:pBdr>
+      </w:pPr>
+      <w:r>
+        <w:rPr>
+          <w:b/>
+          <w:sz w:val="16"/>
+          <w:color w:val="D97736"/>
+        </w:rPr>
+        <w:t>AI GÖRSEL PROMPTU (--ar 4:5):
+</w:t>
+      </w:r>
+      <w:r>
+        <w:rPr>
+          <w:rFonts w:ascii="Consolas" w:hAnsi="Consolas"/>
+          <w:sz w:val="18"/>
+          <w:color w:val="2C3531"/>
+        </w:rPr>
+        <w:t>Split view showing an elevated cozy felt cat cave on top of a bookshelf, and a clean ceramic water fountain in a quiet corner away from the food bowl, warm natural light --ar 4:5 --v 6.0</w:t>
+      </w:r>
+    </w:p>
+    <w:p>
+      <w:pPr>
+        <w:spacing w:before="140" w:after="40"/>
+      </w:pPr>
+      <w:r>
+        <w:rPr>
+          <w:b/>
+          <w:sz w:val="22"/>
+          <w:color w:val="263C34"/>
+        </w:rPr>
+        <w:t>🖼️ Slayt 5: Outro &amp; Call To Action</w:t>
+      </w:r>
+    </w:p>
+    <w:p>
+      <w:pPr>
+        <w:spacing w:before="20" w:after="20"/>
+      </w:pPr>
+      <w:r>
+        <w:rPr>
+          <w:b/>
+          <w:color w:val="5C6A64"/>
+        </w:rPr>
+        <w:t>Canva Başlığı: </w:t>
+      </w:r>
+      <w:r>
+        <w:rPr>
+          <w:b/>
+          <w:color w:val="D97736"/>
+        </w:rPr>
+        <w:t>"SMALL HABITS, HAPPIER CATS"</w:t>
+      </w:r>
+    </w:p>
+    <w:p>
+      <w:pPr>
+        <w:spacing w:before="20" w:after="40"/>
+      </w:pPr>
+      <w:r>
+        <w:rPr>
+          <w:b/>
+          <w:color w:val="5C6A64"/>
+        </w:rPr>
+        <w:t>Canva Alt Açıklama: </w:t>
+      </w:r>
+      <w:r>
+        <w:rPr>
+          <w:i/>
+        </w:rPr>
+        <w:t>Read the full workday routine guide on mewandmaple.com. Save this post for your morning routine! 🔖</w:t>
+      </w:r>
+    </w:p>
+    <w:p>
+      <w:pPr>
+        <w:spacing w:before="40" w:after="120"/>
+        <w:shd w:val="clear" w:color="auto" w:fill="FAF8F5"/>
+        <w:pBdr>
+          <w:left w:val="single" w:sz="18" w:space="10" w:color="D97736"/>
+        </w:pBdr>
+      </w:pPr>
+      <w:r>
+        <w:rPr>
+          <w:b/>
+          <w:sz w:val="16"/>
+          <w:color w:val="D97736"/>
+        </w:rPr>
+        <w:t>AI GÖRSEL PROMPTU (--ar 4:5):
+</w:t>
+      </w:r>
+      <w:r>
+        <w:rPr>
+          <w:rFonts w:ascii="Consolas" w:hAnsi="Consolas"/>
+          <w:sz w:val="18"/>
+          <w:color w:val="2C3531"/>
+        </w:rPr>
+        <w:t>A happy cat stretching its paws lazily on a sunny sofa cushion, peaceful afternoon light, harmonious pet home aesthetic --ar 4:5 --v 6.0</w:t>
+      </w:r>
+    </w:p>
+    <w:p>
+      <w:pPr>
+        <w:spacing w:before="120" w:after="40"/>
+      </w:pPr>
+      <w:r>
+        <w:rPr>
+          <w:b/>
+          <w:color w:val="263C34"/>
+        </w:rPr>
+        <w:t>Gönderi Metni (Caption):</w:t>
+      </w:r>
+    </w:p>
+    <w:p>
+      <w:pPr>
+        <w:spacing w:before="20" w:after="20"/>
+      </w:pPr>
+      <w:r>
+        <w:rPr>
+          <w:sz w:val="20"/>
+        </w:rPr>
+        <w:t>Leaving your indoor cat alone while you're at work? Set up these 4 zones first. 🏢🐈</w:t>
+      </w:r>
+    </w:p>
+    <w:p>
+      <w:pPr>
+        <w:spacing w:before="20" w:after="20"/>
+      </w:pPr>
+      <w:r>
+        <w:rPr>
+          <w:sz w:val="20"/>
+        </w:rPr>
+        <w:t/>
+      </w:r>
+    </w:p>
+    <w:p>
+      <w:pPr>
+        <w:spacing w:before="20" w:after="20"/>
+      </w:pPr>
+      <w:r>
+        <w:rPr>
+          <w:sz w:val="20"/>
+        </w:rPr>
+        <w:t>Cats don't need 8 hours of non-stop action while you're at the office—they sleep 12–16 hours a day! What they need are safe, predictable zones:</w:t>
+      </w:r>
+    </w:p>
+    <w:p>
+      <w:pPr>
+        <w:spacing w:before="20" w:after="20"/>
+      </w:pPr>
+      <w:r>
+        <w:rPr>
+          <w:sz w:val="20"/>
+        </w:rPr>
+        <w:t/>
+      </w:r>
+    </w:p>
+    <w:p>
+      <w:pPr>
+        <w:spacing w:before="20" w:after="20"/>
+      </w:pPr>
+      <w:r>
+        <w:rPr>
+          <w:sz w:val="20"/>
+        </w:rPr>
+        <w:t>☀️ Zone 1: Safe Window Theatre (Bird-watching without blind cord hazards)</w:t>
+      </w:r>
+    </w:p>
+    <w:p>
+      <w:pPr>
+        <w:spacing w:before="20" w:after="20"/>
+      </w:pPr>
+      <w:r>
+        <w:rPr>
+          <w:sz w:val="20"/>
+        </w:rPr>
+        <w:t>🧩 Zone 2: Independent Foraging (Cardboard food puzzles hidden under chairs)</w:t>
+      </w:r>
+    </w:p>
+    <w:p>
+      <w:pPr>
+        <w:spacing w:before="20" w:after="20"/>
+      </w:pPr>
+      <w:r>
+        <w:rPr>
+          <w:sz w:val="20"/>
+        </w:rPr>
+        <w:t>🛋️ Zone 3: High-Altitude Sanctuary (Elevated retreat far from loud hallway noise)</w:t>
+      </w:r>
+    </w:p>
+    <w:p>
+      <w:pPr>
+        <w:spacing w:before="20" w:after="20"/>
+      </w:pPr>
+      <w:r>
+        <w:rPr>
+          <w:sz w:val="20"/>
+        </w:rPr>
+        <w:t>💧 Zone 4: Separated Hydration (Fresh water placed away from the food bowl)</w:t>
+      </w:r>
+    </w:p>
+    <w:p>
+      <w:pPr>
+        <w:spacing w:before="20" w:after="20"/>
+      </w:pPr>
+      <w:r>
+        <w:rPr>
+          <w:sz w:val="20"/>
+        </w:rPr>
+        <w:t/>
+      </w:r>
+    </w:p>
+    <w:p>
+      <w:pPr>
+        <w:spacing w:before="20" w:after="20"/>
+      </w:pPr>
+      <w:r>
+        <w:rPr>
+          <w:sz w:val="20"/>
+        </w:rPr>
+        <w:t>Swipe through to see how to set up each zone!</w:t>
+      </w:r>
+    </w:p>
+    <w:p>
+      <w:pPr>
+        <w:spacing w:before="20" w:after="20"/>
+      </w:pPr>
+      <w:r>
+        <w:rPr>
+          <w:sz w:val="20"/>
+        </w:rPr>
+        <w:t>Save this checklist before heading out tomorrow morning! 🔖</w:t>
+      </w:r>
+    </w:p>
+    <w:p>
+      <w:pPr>
+        <w:spacing w:before="20" w:after="20"/>
+      </w:pPr>
+      <w:r>
+        <w:rPr>
+          <w:sz w:val="20"/>
+        </w:rPr>
+        <w:t>🔗 Full guide at mewandmaple.com (link in bio)!</w:t>
+      </w:r>
+    </w:p>
+    <w:p>
+      <w:pPr>
+        <w:spacing w:before="40" w:after="200"/>
+      </w:pPr>
+      <w:r>
+        <w:rPr>
+          <w:b/>
+          <w:color w:val="263C34"/>
+        </w:rPr>
+        <w:t>Hashtag Seti: </w:t>
+      </w:r>
+      <w:r>
+        <w:rPr>
+          <w:color w:val="5C6A64"/>
+          <w:sz w:val="18"/>
+        </w:rPr>
+        <w:t>#cattips #indoorcat #workingcatmom #boredcat #catwelfare #apartmentliving #catroutine #catlover #catlifestyle #felineenrichment #petparenting #cathealth</w:t>
+      </w:r>
+    </w:p>
+    <w:p>
+      <w:pPr>
+        <w:spacing w:before="400" w:after="100"/>
+        <w:pBdr>
+          <w:top w:val="single" w:sz="18" w:space="10" w:color="263C34"/>
+        </w:pBdr>
+      </w:pPr>
+      <w:r>
+        <w:rPr>
+          <w:rFonts w:ascii="Georgia" w:hAnsi="Georgia"/>
+          <w:b/>
+          <w:sz w:val="32"/>
+          <w:color w:val="263C34"/>
+        </w:rPr>
+        <w:t>Carousel 4: Window Perch vs. Cat Tree: Which Fits Small Homes? (Pencere Yatağı mı Kedi Ağacı mı?)</w:t>
+      </w:r>
+    </w:p>
+    <w:p>
+      <w:pPr>
+        <w:spacing w:before="40" w:after="140"/>
+      </w:pPr>
+      <w:r>
+        <w:rPr>
+          <w:b/>
+          <w:color w:val="263C34"/>
+        </w:rPr>
+        <w:t>Kanca / Hook: </w:t>
+      </w:r>
+      <w:r>
+        <w:rPr>
+          <w:b/>
+          <w:color w:val="D97736"/>
+        </w:rPr>
+        <w:t>Window Perch vs. Cat Tree: Which one actually belongs in a small apartment? 🪟🪵</w:t>
+      </w:r>
+    </w:p>
+    <w:p>
+      <w:pPr>
+        <w:spacing w:before="140" w:after="40"/>
+      </w:pPr>
+      <w:r>
+        <w:rPr>
+          <w:b/>
+          <w:sz w:val="22"/>
+          <w:color w:val="263C34"/>
+        </w:rPr>
+        <w:t>🖼️ Slayt 1: Cover / Hook</w:t>
+      </w:r>
+    </w:p>
+    <w:p>
+      <w:pPr>
+        <w:spacing w:before="20" w:after="20"/>
+      </w:pPr>
+      <w:r>
+        <w:rPr>
+          <w:b/>
+          <w:color w:val="5C6A64"/>
+        </w:rPr>
+        <w:t>Canva Başlığı: </w:t>
+      </w:r>
+      <w:r>
+        <w:rPr>
+          <w:b/>
+          <w:color w:val="D97736"/>
+        </w:rPr>
+        <w:t>"WINDOW PERCH VS. CAT TREE: Which One Actually Fits Your Space?"</w:t>
+      </w:r>
+    </w:p>
+    <w:p>
+      <w:pPr>
+        <w:spacing w:before="20" w:after="40"/>
+      </w:pPr>
+      <w:r>
+        <w:rPr>
+          <w:b/>
+          <w:color w:val="5C6A64"/>
+        </w:rPr>
+        <w:t>Canva Alt Açıklama: </w:t>
+      </w:r>
+      <w:r>
+        <w:rPr>
+          <w:i/>
+        </w:rPr>
+        <w:t>Swipe to compare →</w:t>
+      </w:r>
+    </w:p>
+    <w:p>
+      <w:pPr>
+        <w:spacing w:before="40" w:after="120"/>
+        <w:shd w:val="clear" w:color="auto" w:fill="FAF8F5"/>
+        <w:pBdr>
+          <w:left w:val="single" w:sz="18" w:space="10" w:color="D97736"/>
+        </w:pBdr>
+      </w:pPr>
+      <w:r>
+        <w:rPr>
+          <w:b/>
+          <w:sz w:val="16"/>
+          <w:color w:val="D97736"/>
+        </w:rPr>
+        <w:t>AI GÖRSEL PROMPTU (--ar 4:5):
+</w:t>
+      </w:r>
+      <w:r>
+        <w:rPr>
+          <w:rFonts w:ascii="Consolas" w:hAnsi="Consolas"/>
+          <w:sz w:val="18"/>
+          <w:color w:val="2C3531"/>
+        </w:rPr>
+        <w:t>Split composition: on the left a modern slim wooden cat tree, on the right a sleek window perch with a tabby cat basking in sun, warm minimalist apartment interior, editorial pet product photography --ar 4:5 --v 6.0</w:t>
+      </w:r>
+    </w:p>
+    <w:p>
+      <w:pPr>
+        <w:spacing w:before="140" w:after="40"/>
+      </w:pPr>
+      <w:r>
+        <w:rPr>
+          <w:b/>
+          <w:sz w:val="22"/>
+          <w:color w:val="263C34"/>
+        </w:rPr>
+        <w:t>🖼️ Slayt 2: 1. Floor Footprint Comparison</w:t>
+      </w:r>
+    </w:p>
+    <w:p>
+      <w:pPr>
+        <w:spacing w:before="20" w:after="20"/>
+      </w:pPr>
+      <w:r>
+        <w:rPr>
+          <w:b/>
+          <w:color w:val="5C6A64"/>
+        </w:rPr>
+        <w:t>Canva Başlığı: </w:t>
+      </w:r>
+      <w:r>
+        <w:rPr>
+          <w:b/>
+          <w:color w:val="D97736"/>
+        </w:rPr>
+        <w:t>"1. FLOOR FOOTPRINT"</w:t>
+      </w:r>
+    </w:p>
+    <w:p>
+      <w:pPr>
+        <w:spacing w:before="20" w:after="40"/>
+      </w:pPr>
+      <w:r>
+        <w:rPr>
+          <w:b/>
+          <w:color w:val="5C6A64"/>
+        </w:rPr>
+        <w:t>Canva Alt Açıklama: </w:t>
+      </w:r>
+      <w:r>
+        <w:rPr>
+          <w:i/>
+        </w:rPr>
+        <w:t>Cat trees require at least 2x2 feet of valuable floor space. Window perches take ZERO floor space-ideal for studios under 500 sq ft.</w:t>
+      </w:r>
+    </w:p>
+    <w:p>
+      <w:pPr>
+        <w:spacing w:before="40" w:after="120"/>
+        <w:shd w:val="clear" w:color="auto" w:fill="FAF8F5"/>
+        <w:pBdr>
+          <w:left w:val="single" w:sz="18" w:space="10" w:color="D97736"/>
+        </w:pBdr>
+      </w:pPr>
+      <w:r>
+        <w:rPr>
+          <w:b/>
+          <w:sz w:val="16"/>
+          <w:color w:val="D97736"/>
+        </w:rPr>
+        <w:t>AI GÖRSEL PROMPTU (--ar 4:5):
+</w:t>
+      </w:r>
+      <w:r>
+        <w:rPr>
+          <w:rFonts w:ascii="Consolas" w:hAnsi="Consolas"/>
+          <w:sz w:val="18"/>
+          <w:color w:val="2C3531"/>
+        </w:rPr>
+        <w:t>Clean floor perspective of a compact studio apartment showing a 2x2 foot floor footprint of a cat tree compared to a floating window perch above floor level, bright clean interior --ar 4:5 --v 6.0</w:t>
+      </w:r>
+    </w:p>
+    <w:p>
+      <w:pPr>
+        <w:spacing w:before="140" w:after="40"/>
+      </w:pPr>
+      <w:r>
+        <w:rPr>
+          <w:b/>
+          <w:sz w:val="22"/>
+          <w:color w:val="263C34"/>
+        </w:rPr>
+        <w:t>🖼️ Slayt 3: 2. Scratching &amp; Vertical Exercise</w:t>
+      </w:r>
+    </w:p>
+    <w:p>
+      <w:pPr>
+        <w:spacing w:before="20" w:after="20"/>
+      </w:pPr>
+      <w:r>
+        <w:rPr>
+          <w:b/>
+          <w:color w:val="5C6A64"/>
+        </w:rPr>
+        <w:t>Canva Başlığı: </w:t>
+      </w:r>
+      <w:r>
+        <w:rPr>
+          <w:b/>
+          <w:color w:val="D97736"/>
+        </w:rPr>
+        <w:t>"2. SCRATCHING &amp; STRETCHING"</w:t>
+      </w:r>
+    </w:p>
+    <w:p>
+      <w:pPr>
+        <w:spacing w:before="20" w:after="40"/>
+      </w:pPr>
+      <w:r>
+        <w:rPr>
+          <w:b/>
+          <w:color w:val="5C6A64"/>
+        </w:rPr>
+        <w:t>Canva Alt Açıklama: </w:t>
+      </w:r>
+      <w:r>
+        <w:rPr>
+          <w:i/>
+        </w:rPr>
+        <w:t>Cat trees provide full-body vertical scratching exercise. Window perches only provide rest and observation.</w:t>
+      </w:r>
+    </w:p>
+    <w:p>
+      <w:pPr>
+        <w:spacing w:before="40" w:after="120"/>
+        <w:shd w:val="clear" w:color="auto" w:fill="FAF8F5"/>
+        <w:pBdr>
+          <w:left w:val="single" w:sz="18" w:space="10" w:color="D97736"/>
+        </w:pBdr>
+      </w:pPr>
+      <w:r>
+        <w:rPr>
+          <w:b/>
+          <w:sz w:val="16"/>
+          <w:color w:val="D97736"/>
+        </w:rPr>
+        <w:t>AI GÖRSEL PROMPTU (--ar 4:5):
+</w:t>
+      </w:r>
+      <w:r>
+        <w:rPr>
+          <w:rFonts w:ascii="Consolas" w:hAnsi="Consolas"/>
+          <w:sz w:val="18"/>
+          <w:color w:val="2C3531"/>
+        </w:rPr>
+        <w:t>Cat stretching full vertical length scratching a thick textured sisal post, showing strength and flexibility, warm indoor light --ar 4:5 --v 6.0</w:t>
+      </w:r>
+    </w:p>
+    <w:p>
+      <w:pPr>
+        <w:spacing w:before="140" w:after="40"/>
+      </w:pPr>
+      <w:r>
+        <w:rPr>
+          <w:b/>
+          <w:sz w:val="22"/>
+          <w:color w:val="263C34"/>
+        </w:rPr>
+        <w:t>🖼️ Slayt 4: 3. Stability &amp; Weight Safety</w:t>
+      </w:r>
+    </w:p>
+    <w:p>
+      <w:pPr>
+        <w:spacing w:before="20" w:after="20"/>
+      </w:pPr>
+      <w:r>
+        <w:rPr>
+          <w:b/>
+          <w:color w:val="5C6A64"/>
+        </w:rPr>
+        <w:t>Canva Başlığı: </w:t>
+      </w:r>
+      <w:r>
+        <w:rPr>
+          <w:b/>
+          <w:color w:val="D97736"/>
+        </w:rPr>
+        <w:t>"3. STABILITY &amp; SAFETY"</w:t>
+      </w:r>
+    </w:p>
+    <w:p>
+      <w:pPr>
+        <w:spacing w:before="20" w:after="40"/>
+      </w:pPr>
+      <w:r>
+        <w:rPr>
+          <w:b/>
+          <w:color w:val="5C6A64"/>
+        </w:rPr>
+        <w:t>Canva Alt Açıklama: </w:t>
+      </w:r>
+      <w:r>
+        <w:rPr>
+          <w:i/>
+        </w:rPr>
+        <w:t>Perches need weekly suction checks and solid glass. Trees require heavy bases (18x18"+) so they never wobble during jumps.</w:t>
+      </w:r>
+    </w:p>
+    <w:p>
+      <w:pPr>
+        <w:spacing w:before="40" w:after="120"/>
+        <w:shd w:val="clear" w:color="auto" w:fill="FAF8F5"/>
+        <w:pBdr>
+          <w:left w:val="single" w:sz="18" w:space="10" w:color="D97736"/>
+        </w:pBdr>
+      </w:pPr>
+      <w:r>
+        <w:rPr>
+          <w:b/>
+          <w:sz w:val="16"/>
+          <w:color w:val="D97736"/>
+        </w:rPr>
+        <w:t>AI GÖRSEL PROMPTU (--ar 4:5):
+</w:t>
+      </w:r>
+      <w:r>
+        <w:rPr>
+          <w:rFonts w:ascii="Consolas" w:hAnsi="Consolas"/>
+          <w:sz w:val="18"/>
+          <w:color w:val="2C3531"/>
+        </w:rPr>
+        <w:t>Close up of sturdy suction cups attached firmly to a clean glass window, and a heavy solid wood base of a cat tree, warm natural light, reassuring stability --ar 4:5 --v 6.0</w:t>
+      </w:r>
+    </w:p>
+    <w:p>
+      <w:pPr>
+        <w:spacing w:before="140" w:after="40"/>
+      </w:pPr>
+      <w:r>
+        <w:rPr>
+          <w:b/>
+          <w:sz w:val="22"/>
+          <w:color w:val="263C34"/>
+        </w:rPr>
+        <w:t>🖼️ Slayt 5: Outro &amp; Small-Space Formula</w:t>
+      </w:r>
+    </w:p>
+    <w:p>
+      <w:pPr>
+        <w:spacing w:before="20" w:after="20"/>
+      </w:pPr>
+      <w:r>
+        <w:rPr>
+          <w:b/>
+          <w:color w:val="5C6A64"/>
+        </w:rPr>
+        <w:t>Canva Başlığı: </w:t>
+      </w:r>
+      <w:r>
+        <w:rPr>
+          <w:b/>
+          <w:color w:val="D97736"/>
+        </w:rPr>
+        <w:t>"OUR SMALL-SPACE VERDICT"</w:t>
+      </w:r>
+    </w:p>
+    <w:p>
+      <w:pPr>
+        <w:spacing w:before="20" w:after="40"/>
+      </w:pPr>
+      <w:r>
+        <w:rPr>
+          <w:b/>
+          <w:color w:val="5C6A64"/>
+        </w:rPr>
+        <w:t>Canva Alt Açıklama: </w:t>
+      </w:r>
+      <w:r>
+        <w:rPr>
+          <w:i/>
+        </w:rPr>
+        <w:t>Get a sturdy window perch for views + a slim vertical post for scratching. Best of both worlds! Full review at mewandmaple.com.</w:t>
+      </w:r>
+    </w:p>
+    <w:p>
+      <w:pPr>
+        <w:spacing w:before="40" w:after="120"/>
+        <w:shd w:val="clear" w:color="auto" w:fill="FAF8F5"/>
+        <w:pBdr>
+          <w:left w:val="single" w:sz="18" w:space="10" w:color="D97736"/>
+        </w:pBdr>
+      </w:pPr>
+      <w:r>
+        <w:rPr>
+          <w:b/>
+          <w:sz w:val="16"/>
+          <w:color w:val="D97736"/>
+        </w:rPr>
+        <w:t>AI GÖRSEL PROMPTU (--ar 4:5):
+</w:t>
+      </w:r>
+      <w:r>
+        <w:rPr>
+          <w:rFonts w:ascii="Consolas" w:hAnsi="Consolas"/>
+          <w:sz w:val="18"/>
+          <w:color w:val="2C3531"/>
+        </w:rPr>
+        <w:t>A stylish apartment living room with a slim sisal post next to the sofa and a sunlit window perch, cat resting happily on the perch, perfect compact harmony --ar 4:5 --v 6.0</w:t>
+      </w:r>
+    </w:p>
+    <w:p>
+      <w:pPr>
+        <w:spacing w:before="120" w:after="40"/>
+      </w:pPr>
+      <w:r>
+        <w:rPr>
+          <w:b/>
+          <w:color w:val="263C34"/>
+        </w:rPr>
+        <w:t>Gönderi Metni (Caption):</w:t>
+      </w:r>
+    </w:p>
+    <w:p>
+      <w:pPr>
+        <w:spacing w:before="20" w:after="20"/>
+      </w:pPr>
+      <w:r>
+        <w:rPr>
+          <w:sz w:val="20"/>
+        </w:rPr>
+        <w:t>Window Perch vs. Cat Tree: Which one actually belongs in a small apartment? 🪟🪵</w:t>
+      </w:r>
+    </w:p>
+    <w:p>
+      <w:pPr>
+        <w:spacing w:before="20" w:after="20"/>
+      </w:pPr>
+      <w:r>
+        <w:rPr>
+          <w:sz w:val="20"/>
+        </w:rPr>
+        <w:t/>
+      </w:r>
+    </w:p>
+    <w:p>
+      <w:pPr>
+        <w:spacing w:before="20" w:after="20"/>
+      </w:pPr>
+      <w:r>
+        <w:rPr>
+          <w:sz w:val="20"/>
+        </w:rPr>
+        <w:t>Tight on square footage? Don't buy bulky carpet towers before reading this comparison:</w:t>
+      </w:r>
+    </w:p>
+    <w:p>
+      <w:pPr>
+        <w:spacing w:before="20" w:after="20"/>
+      </w:pPr>
+      <w:r>
+        <w:rPr>
+          <w:sz w:val="20"/>
+        </w:rPr>
+        <w:t/>
+      </w:r>
+    </w:p>
+    <w:p>
+      <w:pPr>
+        <w:spacing w:before="20" w:after="20"/>
+      </w:pPr>
+      <w:r>
+        <w:rPr>
+          <w:sz w:val="20"/>
+        </w:rPr>
+        <w:t>📐 Floor Space:</w:t>
+      </w:r>
+    </w:p>
+    <w:p>
+      <w:pPr>
+        <w:spacing w:before="20" w:after="20"/>
+      </w:pPr>
+      <w:r>
+        <w:rPr>
+          <w:sz w:val="20"/>
+        </w:rPr>
+        <w:t>Cat trees eat up at least 2x2 feet of floor space. Window perches take ZERO floor space.</w:t>
+      </w:r>
+    </w:p>
+    <w:p>
+      <w:pPr>
+        <w:spacing w:before="20" w:after="20"/>
+      </w:pPr>
+      <w:r>
+        <w:rPr>
+          <w:sz w:val="20"/>
+        </w:rPr>
+        <w:t/>
+      </w:r>
+    </w:p>
+    <w:p>
+      <w:pPr>
+        <w:spacing w:before="20" w:after="20"/>
+      </w:pPr>
+      <w:r>
+        <w:rPr>
+          <w:sz w:val="20"/>
+        </w:rPr>
+        <w:t>🐾 Scratching &amp; Exercise:</w:t>
+      </w:r>
+    </w:p>
+    <w:p>
+      <w:pPr>
+        <w:spacing w:before="20" w:after="20"/>
+      </w:pPr>
+      <w:r>
+        <w:rPr>
+          <w:sz w:val="20"/>
+        </w:rPr>
+        <w:t>Cat trees provide crucial vertical stretching and scratching posts. Window perches only offer lounging and outdoor viewing.</w:t>
+      </w:r>
+    </w:p>
+    <w:p>
+      <w:pPr>
+        <w:spacing w:before="20" w:after="20"/>
+      </w:pPr>
+      <w:r>
+        <w:rPr>
+          <w:sz w:val="20"/>
+        </w:rPr>
+        <w:t/>
+      </w:r>
+    </w:p>
+    <w:p>
+      <w:pPr>
+        <w:spacing w:before="20" w:after="20"/>
+      </w:pPr>
+      <w:r>
+        <w:rPr>
+          <w:sz w:val="20"/>
+        </w:rPr>
+        <w:t>⚖️ Stability &amp; Safety:</w:t>
+      </w:r>
+    </w:p>
+    <w:p>
+      <w:pPr>
+        <w:spacing w:before="20" w:after="20"/>
+      </w:pPr>
+      <w:r>
+        <w:rPr>
+          <w:sz w:val="20"/>
+        </w:rPr>
+        <w:t>Window perches require solid glass and weekly suction checks. Cat trees require heavy weighted bases so they don't tip during sprints.</w:t>
+      </w:r>
+    </w:p>
+    <w:p>
+      <w:pPr>
+        <w:spacing w:before="20" w:after="20"/>
+      </w:pPr>
+      <w:r>
+        <w:rPr>
+          <w:sz w:val="20"/>
+        </w:rPr>
+        <w:t/>
+      </w:r>
+    </w:p>
+    <w:p>
+      <w:pPr>
+        <w:spacing w:before="20" w:after="20"/>
+      </w:pPr>
+      <w:r>
+        <w:rPr>
+          <w:sz w:val="20"/>
+        </w:rPr>
+        <w:t>💡 The Small-Apartment Formula:</w:t>
+      </w:r>
+    </w:p>
+    <w:p>
+      <w:pPr>
+        <w:spacing w:before="20" w:after="20"/>
+      </w:pPr>
+      <w:r>
+        <w:rPr>
+          <w:sz w:val="20"/>
+        </w:rPr>
+        <w:t>Pair a slim suction-cup window perch for bird watching WITH a tall, space-saving sisal post placed right next to your couch!</w:t>
+      </w:r>
+    </w:p>
+    <w:p>
+      <w:pPr>
+        <w:spacing w:before="20" w:after="20"/>
+      </w:pPr>
+      <w:r>
+        <w:rPr>
+          <w:sz w:val="20"/>
+        </w:rPr>
+        <w:t/>
+      </w:r>
+    </w:p>
+    <w:p>
+      <w:pPr>
+        <w:spacing w:before="20" w:after="20"/>
+      </w:pPr>
+      <w:r>
+        <w:rPr>
+          <w:sz w:val="20"/>
+        </w:rPr>
+        <w:t>Swipe through for the full comparison! Save this before you shop! 🛍️</w:t>
+      </w:r>
+    </w:p>
+    <w:p>
+      <w:pPr>
+        <w:spacing w:before="20" w:after="20"/>
+      </w:pPr>
+      <w:r>
+        <w:rPr>
+          <w:sz w:val="20"/>
+        </w:rPr>
+        <w:t>🔗 Full buyer review on mewandmaple.com!</w:t>
+      </w:r>
+    </w:p>
+    <w:p>
+      <w:pPr>
+        <w:spacing w:before="40" w:after="200"/>
+      </w:pPr>
+      <w:r>
+        <w:rPr>
+          <w:b/>
+          <w:color w:val="263C34"/>
+        </w:rPr>
+        <w:t>Hashtag Seti: </w:t>
+      </w:r>
+      <w:r>
+        <w:rPr>
+          <w:color w:val="5C6A64"/>
+          <w:sz w:val="18"/>
+        </w:rPr>
+        <w:t>#cattree #catperch #windowperch #catgear #catfurniture #smallspaceliving #petcareadvice #catmomproblems #apartmentlivingwithcats #catparent #indoorcatcare</w:t>
+      </w:r>
+    </w:p>
   </w:body>
 </w:document>
 </file>
</xml_diff>